<commit_message>
[report] tighten Fact Sheet 5 narrative tone, no number changes
</commit_message>
<xml_diff>
--- a/phase2/factsheets/factsheet5_significance.docx
+++ b/phase2/factsheets/factsheet5_significance.docx
@@ -137,7 +137,7 @@
         <w:t xml:space="preserve"> </w:t>
       </w:r>
       <w:r>
-        <w:t xml:space="preserve">24,</w:t>
+        <w:t xml:space="preserve">25,</w:t>
       </w:r>
       <w:r>
         <w:t xml:space="preserve"> </w:t>
@@ -318,20 +318,7 @@
               <w:t xml:space="preserve"> </w:t>
             </w:r>
             <w:r>
-              <w:t xml:space="preserve">A not-significant finding puts a project on the fast track (a</w:t>
-            </w:r>
-            <w:r>
-              <w:t xml:space="preserve"> </w:t>
-            </w:r>
-            <w:r>
-              <w:rPr>
-                <w:iCs/>
-                <w:i/>
-              </w:rPr>
-              <w:t xml:space="preserve">Finding of No Significant Impact</w:t>
-            </w:r>
-            <w:r>
-              <w:t xml:space="preserve">, or FONSI); a significant finding triggers a full Environmental Impact Statement (EIS) that can add a year or more. This fact sheet is the first systematic look at how agencies draw that line for decarbonization projects.</w:t>
+              <w:t xml:space="preserve">A not-significant finding puts a project on the fast track (a Finding of No Significant Impact, or FONSI); a significant finding triggers a full Environmental Impact Statement (EIS) that can add a year or more. This fact sheet is the first systematic look at how agencies draw that line for decarbonization projects.</w:t>
             </w:r>
           </w:p>
           <w:p>
@@ -347,70 +334,31 @@
                 <w:bCs/>
                 <w:b/>
               </w:rPr>
-              <w:t xml:space="preserve">Most decarbonization FONSIs are</w:t>
-            </w:r>
-            <w:r>
-              <w:rPr>
-                <w:bCs/>
-                <w:b/>
-              </w:rPr>
+              <w:t xml:space="preserve">Most decarbonization FONSIs are mitigated.</w:t>
+            </w:r>
+            <w:r>
               <w:t xml:space="preserve"> </w:t>
             </w:r>
             <w:r>
-              <w:rPr>
-                <w:iCs/>
-                <w:i/>
-                <w:bCs/>
-                <w:b/>
-              </w:rPr>
-              <w:t xml:space="preserve">mitigated</w:t>
-            </w:r>
-            <w:r>
-              <w:rPr>
-                <w:bCs/>
-                <w:b/>
-              </w:rPr>
-              <w:t xml:space="preserve">.</w:t>
+              <w:t xml:space="preserve">About 58% of analyzed FONSI decision documents reach</w:t>
             </w:r>
             <w:r>
               <w:t xml:space="preserve"> </w:t>
             </w:r>
             <w:r>
-              <w:t xml:space="preserve">About 58% of analyzed FONSI decision documents reach</w:t>
+              <w:t xml:space="preserve">“</w:t>
+            </w:r>
+            <w:r>
+              <w:t xml:space="preserve">no significant impact</w:t>
+            </w:r>
+            <w:r>
+              <w:t xml:space="preserve">”</w:t>
             </w:r>
             <w:r>
               <w:t xml:space="preserve"> </w:t>
             </w:r>
             <w:r>
-              <w:t xml:space="preserve">“</w:t>
-            </w:r>
-            <w:r>
-              <w:t xml:space="preserve">no significant impact</w:t>
-            </w:r>
-            <w:r>
-              <w:t xml:space="preserve">”</w:t>
-            </w:r>
-            <w:r>
-              <w:t xml:space="preserve"> </w:t>
-            </w:r>
-            <w:r>
-              <w:t xml:space="preserve">only because the developer commits to specific measures — the impact</w:t>
-            </w:r>
-            <w:r>
-              <w:t xml:space="preserve"> </w:t>
-            </w:r>
-            <w:r>
-              <w:rPr>
-                <w:iCs/>
-                <w:i/>
-              </w:rPr>
-              <w:t xml:space="preserve">would</w:t>
-            </w:r>
-            <w:r>
-              <w:t xml:space="preserve"> </w:t>
-            </w:r>
-            <w:r>
-              <w:t xml:space="preserve">have been significant otherwise. The mitigation burden concentrates in a handful of resources: biological (30%), soils / geology (28%), water (26%), cultural / historic (22%).</w:t>
+              <w:t xml:space="preserve">only because the developer commits to specific measures — the impact would have been significant otherwise. The mitigation burden concentrates in a handful of resources: biological (30%), soils / geology (28%), water (26%), cultural / historic (22%).</w:t>
             </w:r>
           </w:p>
           <w:p>
@@ -432,20 +380,7 @@
               <w:t xml:space="preserve"> </w:t>
             </w:r>
             <w:r>
-              <w:t xml:space="preserve">— judged significant more often than any other resource (visual (33%)), and most likely to be declared</w:t>
-            </w:r>
-            <w:r>
-              <w:t xml:space="preserve"> </w:t>
-            </w:r>
-            <w:r>
-              <w:rPr>
-                <w:iCs/>
-                <w:i/>
-              </w:rPr>
-              <w:t xml:space="preserve">significant and unavoidable</w:t>
-            </w:r>
-            <w:r>
-              <w:t xml:space="preserve">, because a changed landscape usually cannot be mitigated back.</w:t>
+              <w:t xml:space="preserve">— judged significant more often than any other resource (visual (33%)), and most likely to be declared significant and unavoidable, because a changed landscape usually cannot be mitigated back.</w:t>
             </w:r>
           </w:p>
           <w:p>
@@ -483,7 +418,7 @@
                 <w:bCs/>
                 <w:b/>
               </w:rPr>
-              <w:t xml:space="preserve">Mitigation does enormous work — but is not always demonstrably enforceable.</w:t>
+              <w:t xml:space="preserve">Mitigation does much of the work — but is not always demonstrably enforceable.</w:t>
             </w:r>
             <w:r>
               <w:t xml:space="preserve"> </w:t>
@@ -553,79 +488,7 @@
         <w:pStyle w:val="FirstParagraph"/>
       </w:pPr>
       <w:r>
-        <w:t xml:space="preserve">When a decarbonization project — a solar farm, a transmission line — needs federal approval, the lead agency studies its environmental impact and makes one judgment call: is the impact</w:t>
-      </w:r>
-      <w:r>
-        <w:t xml:space="preserve"> </w:t>
-      </w:r>
-      <w:r>
-        <w:rPr>
-          <w:bCs/>
-          <w:b/>
-        </w:rPr>
-        <w:t xml:space="preserve">“</w:t>
-      </w:r>
-      <w:r>
-        <w:rPr>
-          <w:bCs/>
-          <w:b/>
-        </w:rPr>
-        <w:t xml:space="preserve">significant</w:t>
-      </w:r>
-      <w:r>
-        <w:rPr>
-          <w:bCs/>
-          <w:b/>
-        </w:rPr>
-        <w:t xml:space="preserve">”</w:t>
-      </w:r>
-      <w:r>
-        <w:t xml:space="preserve"> </w:t>
-      </w:r>
-      <w:r>
-        <w:t xml:space="preserve">or not? That single word decides the project’s review path. If the agency finds the impact</w:t>
-      </w:r>
-      <w:r>
-        <w:t xml:space="preserve"> </w:t>
-      </w:r>
-      <w:r>
-        <w:rPr>
-          <w:bCs/>
-          <w:b/>
-        </w:rPr>
-        <w:t xml:space="preserve">not significant</w:t>
-      </w:r>
-      <w:r>
-        <w:t xml:space="preserve">, the project moves ahead on a faster track, documented in a</w:t>
-      </w:r>
-      <w:r>
-        <w:t xml:space="preserve"> </w:t>
-      </w:r>
-      <w:r>
-        <w:rPr>
-          <w:iCs/>
-          <w:i/>
-        </w:rPr>
-        <w:t xml:space="preserve">Finding of No Significant Impact</w:t>
-      </w:r>
-      <w:r>
-        <w:t xml:space="preserve"> </w:t>
-      </w:r>
-      <w:r>
-        <w:t xml:space="preserve">(FONSI). If it finds the impact</w:t>
-      </w:r>
-      <w:r>
-        <w:t xml:space="preserve"> </w:t>
-      </w:r>
-      <w:r>
-        <w:rPr>
-          <w:bCs/>
-          <w:b/>
-        </w:rPr>
-        <w:t xml:space="preserve">significant</w:t>
-      </w:r>
-      <w:r>
-        <w:t xml:space="preserve">, that triggers a full Environmental Impact Statement (EIS) — a far longer, more demanding review that routinely adds a year or more to the timeline.</w:t>
+        <w:t xml:space="preserve">When a decarbonization project (a solar farm or a transmission line) needs federal approval, the lead agency studies its environmental impact and makes one judgment call: is that impact significant or not? That single determination decides the project’s review path. If the agency finds the impact not significant, the project moves ahead on a faster track, documented in a Finding of No Significant Impact (FONSI). If it finds the impact significant, the project requires a full Environmental Impact Statement (EIS), a longer and more demanding review that routinely adds a year or more to the timeline.</w:t>
       </w:r>
     </w:p>
     <w:p>
@@ -633,36 +496,7 @@
         <w:pStyle w:val="BodyText"/>
       </w:pPr>
       <w:r>
-        <w:t xml:space="preserve">Often the agency lands in between:</w:t>
-      </w:r>
-      <w:r>
-        <w:t xml:space="preserve"> </w:t>
-      </w:r>
-      <w:r>
-        <w:rPr>
-          <w:iCs/>
-          <w:i/>
-        </w:rPr>
-        <w:t xml:space="preserve">this impact would be significant — unless the developer commits to specific measures to reduce it.</w:t>
-      </w:r>
-      <w:r>
-        <w:t xml:space="preserve"> </w:t>
-      </w:r>
-      <w:r>
-        <w:t xml:space="preserve">That is a</w:t>
-      </w:r>
-      <w:r>
-        <w:t xml:space="preserve"> </w:t>
-      </w:r>
-      <w:r>
-        <w:rPr>
-          <w:bCs/>
-          <w:b/>
-        </w:rPr>
-        <w:t xml:space="preserve">mitigated finding</w:t>
-      </w:r>
-      <w:r>
-        <w:t xml:space="preserve">, and it is the most revealing case, because it shows the exact line the agency drew and what it required to stay on the safe side of it.</w:t>
+        <w:t xml:space="preserve">Often the agency lands in between: the impact would be significant unless the developer commits to specific measures to reduce it. That is a mitigated finding, and it is the most revealing case, because it shows the exact line the agency drew and what it required to stay on the safe side of it.</w:t>
       </w:r>
     </w:p>
     <w:p>
@@ -753,17 +587,7 @@
               <w:jc w:val="left"/>
             </w:pPr>
             <w:r>
-              <w:rPr>
-                <w:bCs/>
-                <w:b/>
-              </w:rPr>
-              <w:t xml:space="preserve">Above the line</w:t>
-            </w:r>
-            <w:r>
-              <w:t xml:space="preserve"> </w:t>
-            </w:r>
-            <w:r>
-              <w:t xml:space="preserve">(EIS)</w:t>
+              <w:t xml:space="preserve">Above the line (EIS)</w:t>
             </w:r>
           </w:p>
         </w:tc>
@@ -787,47 +611,21 @@
               <w:jc w:val="left"/>
             </w:pPr>
             <w:r>
-              <w:t xml:space="preserve">The impact is significant and</w:t>
-            </w:r>
-            <w:r>
-              <w:t xml:space="preserve"> </w:t>
-            </w:r>
-            <w:r>
-              <w:rPr>
-                <w:iCs/>
-                <w:i/>
-              </w:rPr>
-              <w:t xml:space="preserve">no available measure</w:t>
-            </w:r>
-            <w:r>
-              <w:t xml:space="preserve"> </w:t>
-            </w:r>
-            <w:r>
-              <w:t xml:space="preserve">can bring it below the threshold — the extreme case.</w:t>
-            </w:r>
-          </w:p>
-        </w:tc>
-      </w:tr>
-      <w:tr>
-        <w:tc>
-          <w:tcPr/>
-          <w:p>
-            <w:pPr>
-              <w:pStyle w:val="Compact"/>
-              <w:jc w:val="left"/>
-            </w:pPr>
-            <w:r>
-              <w:rPr>
-                <w:bCs/>
-                <w:b/>
-              </w:rPr>
-              <w:t xml:space="preserve">Above the line</w:t>
-            </w:r>
-            <w:r>
-              <w:t xml:space="preserve"> </w:t>
-            </w:r>
-            <w:r>
-              <w:t xml:space="preserve">(EIS)</w:t>
+              <w:t xml:space="preserve">The impact is significant and no available measure can bring it below the threshold — the extreme case.</w:t>
+            </w:r>
+          </w:p>
+        </w:tc>
+      </w:tr>
+      <w:tr>
+        <w:tc>
+          <w:tcPr/>
+          <w:p>
+            <w:pPr>
+              <w:pStyle w:val="Compact"/>
+              <w:jc w:val="left"/>
+            </w:pPr>
+            <w:r>
+              <w:t xml:space="preserve">Above the line (EIS)</w:t>
             </w:r>
           </w:p>
         </w:tc>
@@ -865,10 +663,6 @@
               <w:jc w:val="left"/>
             </w:pPr>
             <w:r>
-              <w:rPr>
-                <w:bCs/>
-                <w:b/>
-              </w:rPr>
               <w:t xml:space="preserve">— the significance line —</w:t>
             </w:r>
           </w:p>
@@ -889,10 +683,6 @@
               <w:jc w:val="left"/>
             </w:pPr>
             <w:r>
-              <w:rPr>
-                <w:iCs/>
-                <w:i/>
-              </w:rPr>
               <w:t xml:space="preserve">The threshold that separates the fast track from the full review.</w:t>
             </w:r>
           </w:p>
@@ -907,17 +697,45 @@
               <w:jc w:val="left"/>
             </w:pPr>
             <w:r>
-              <w:rPr>
-                <w:bCs/>
-                <w:b/>
-              </w:rPr>
-              <w:t xml:space="preserve">Below the line</w:t>
-            </w:r>
-            <w:r>
-              <w:t xml:space="preserve"> </w:t>
-            </w:r>
-            <w:r>
-              <w:t xml:space="preserve">(FONSI)</w:t>
+              <w:t xml:space="preserve">Below the line (FONSI)</w:t>
+            </w:r>
+          </w:p>
+        </w:tc>
+        <w:tc>
+          <w:tcPr/>
+          <w:p>
+            <w:pPr>
+              <w:pStyle w:val="Compact"/>
+              <w:jc w:val="left"/>
+            </w:pPr>
+            <w:r>
+              <w:t xml:space="preserve">Less than significant with committed mitigation</w:t>
+            </w:r>
+          </w:p>
+        </w:tc>
+        <w:tc>
+          <w:tcPr/>
+          <w:p>
+            <w:pPr>
+              <w:pStyle w:val="Compact"/>
+              <w:jc w:val="left"/>
+            </w:pPr>
+            <w:r>
+              <w:t xml:space="preserve">The impact would cross the line, but required measures pull it under — the mitigated FONSI, this fact sheet’s central subject.</w:t>
+            </w:r>
+          </w:p>
+        </w:tc>
+      </w:tr>
+      <w:tr>
+        <w:tc>
+          <w:tcPr/>
+          <w:p>
+            <w:pPr>
+              <w:pStyle w:val="Compact"/>
+              <w:jc w:val="left"/>
+            </w:pPr>
+            <w:r>
+              <w:t xml:space="preserve">Below the line (FONSI)</w:t>
             </w:r>
           </w:p>
         </w:tc>
@@ -931,93 +749,6 @@
             <w:r>
               <w:t xml:space="preserve">Less than significant</w:t>
             </w:r>
-            <w:r>
-              <w:t xml:space="preserve"> </w:t>
-            </w:r>
-            <w:r>
-              <w:rPr>
-                <w:iCs/>
-                <w:i/>
-              </w:rPr>
-              <w:t xml:space="preserve">with committed mitigation</w:t>
-            </w:r>
-          </w:p>
-        </w:tc>
-        <w:tc>
-          <w:tcPr/>
-          <w:p>
-            <w:pPr>
-              <w:pStyle w:val="Compact"/>
-              <w:jc w:val="left"/>
-            </w:pPr>
-            <w:r>
-              <w:t xml:space="preserve">The impact</w:t>
-            </w:r>
-            <w:r>
-              <w:t xml:space="preserve"> </w:t>
-            </w:r>
-            <w:r>
-              <w:rPr>
-                <w:iCs/>
-                <w:i/>
-              </w:rPr>
-              <w:t xml:space="preserve">would</w:t>
-            </w:r>
-            <w:r>
-              <w:t xml:space="preserve"> </w:t>
-            </w:r>
-            <w:r>
-              <w:t xml:space="preserve">cross the line, but required measures pull it under — the</w:t>
-            </w:r>
-            <w:r>
-              <w:t xml:space="preserve"> </w:t>
-            </w:r>
-            <w:r>
-              <w:rPr>
-                <w:bCs/>
-                <w:b/>
-              </w:rPr>
-              <w:t xml:space="preserve">mitigated FONSI</w:t>
-            </w:r>
-            <w:r>
-              <w:t xml:space="preserve">, this fact sheet’s central subject.</w:t>
-            </w:r>
-          </w:p>
-        </w:tc>
-      </w:tr>
-      <w:tr>
-        <w:tc>
-          <w:tcPr/>
-          <w:p>
-            <w:pPr>
-              <w:pStyle w:val="Compact"/>
-              <w:jc w:val="left"/>
-            </w:pPr>
-            <w:r>
-              <w:rPr>
-                <w:bCs/>
-                <w:b/>
-              </w:rPr>
-              <w:t xml:space="preserve">Below the line</w:t>
-            </w:r>
-            <w:r>
-              <w:t xml:space="preserve"> </w:t>
-            </w:r>
-            <w:r>
-              <w:t xml:space="preserve">(FONSI)</w:t>
-            </w:r>
-          </w:p>
-        </w:tc>
-        <w:tc>
-          <w:tcPr/>
-          <w:p>
-            <w:pPr>
-              <w:pStyle w:val="Compact"/>
-              <w:jc w:val="left"/>
-            </w:pPr>
-            <w:r>
-              <w:t xml:space="preserve">Less than significant</w:t>
-            </w:r>
           </w:p>
         </w:tc>
         <w:tc>
@@ -1042,17 +773,7 @@
               <w:jc w:val="left"/>
             </w:pPr>
             <w:r>
-              <w:rPr>
-                <w:bCs/>
-                <w:b/>
-              </w:rPr>
-              <w:t xml:space="preserve">Below the line</w:t>
-            </w:r>
-            <w:r>
-              <w:t xml:space="preserve"> </w:t>
-            </w:r>
-            <w:r>
-              <w:t xml:space="preserve">(FONSI)</w:t>
+              <w:t xml:space="preserve">Below the line (FONSI)</w:t>
             </w:r>
           </w:p>
         </w:tc>
@@ -1087,23 +808,7 @@
         <w:pStyle w:val="BodyText"/>
       </w:pPr>
       <w:r>
-        <w:t xml:space="preserve">Despite how much rides on this determination, there has been no prior research we are aware of showing the</w:t>
-      </w:r>
-      <w:r>
-        <w:t xml:space="preserve"> </w:t>
-      </w:r>
-      <w:r>
-        <w:rPr>
-          <w:iCs/>
-          <w:i/>
-        </w:rPr>
-        <w:t xml:space="preserve">trends</w:t>
-      </w:r>
-      <w:r>
-        <w:t xml:space="preserve"> </w:t>
-      </w:r>
-      <w:r>
-        <w:t xml:space="preserve">in significance calls: how often agencies stay below the line, the role mitigation plays, and which environmental factors push a project over the threshold. Answering those questions means reading a judgment call out of thousands of dense decision documents — far more than anyone could review by hand.</w:t>
+        <w:t xml:space="preserve">Despite how much rides on this determination, there has been no prior research we are aware of showing the trends in significance calls: how often agencies stay below the line, the role mitigation plays, and which environmental factors push a project over the threshold. Answering those questions means reading a judgment call out of thousands of dense decision documents — far more than anyone could review by hand.</w:t>
       </w:r>
     </w:p>
     <w:bookmarkEnd w:id="24"/>
@@ -1121,52 +826,7 @@
         <w:pStyle w:val="FirstParagraph"/>
       </w:pPr>
       <w:r>
-        <w:t xml:space="preserve">We analyze two document tracks separately, because they record opposite outcomes.</w:t>
-      </w:r>
-      <w:r>
-        <w:t xml:space="preserve"> </w:t>
-      </w:r>
-      <w:r>
-        <w:rPr>
-          <w:bCs/>
-          <w:b/>
-        </w:rPr>
-        <w:t xml:space="preserve">FONSIs are the below-the-line record</w:t>
-      </w:r>
-      <w:r>
-        <w:t xml:space="preserve"> </w:t>
-      </w:r>
-      <w:r>
-        <w:t xml:space="preserve">— where agencies concluded the impact is not significant, and where the mitigated cases live.</w:t>
-      </w:r>
-      <w:r>
-        <w:t xml:space="preserve"> </w:t>
-      </w:r>
-      <w:r>
-        <w:rPr>
-          <w:bCs/>
-          <w:b/>
-        </w:rPr>
-        <w:t xml:space="preserve">EISs are the above-the-line record</w:t>
-      </w:r>
-      <w:r>
-        <w:t xml:space="preserve"> </w:t>
-      </w:r>
-      <w:r>
-        <w:t xml:space="preserve">— impacts the agency judged significant, and at the extreme significant</w:t>
-      </w:r>
-      <w:r>
-        <w:t xml:space="preserve"> </w:t>
-      </w:r>
-      <w:r>
-        <w:rPr>
-          <w:iCs/>
-          <w:i/>
-        </w:rPr>
-        <w:t xml:space="preserve">and unavoidable</w:t>
-      </w:r>
-      <w:r>
-        <w:t xml:space="preserve">.</w:t>
+        <w:t xml:space="preserve">We analyze two document tracks separately, because they record opposite outcomes. FONSIs are the below-the-line record, where agencies concluded the impact is not significant and where the mitigated cases live. EISs are the above-the-line record: impacts the agency judged significant, and at the extreme significant and unavoidable.</w:t>
       </w:r>
     </w:p>
     <w:p>
@@ -1287,36 +947,7 @@
         <w:pStyle w:val="FirstParagraph"/>
       </w:pPr>
       <w:r>
-        <w:t xml:space="preserve">The FONSI analysis rests on the decarbonization FONSIs that are led by BLM or the Department of Energy family and carry machine-extractable significance findings —</w:t>
-      </w:r>
-      <w:r>
-        <w:t xml:space="preserve"> </w:t>
-      </w:r>
-      <w:r>
-        <w:rPr>
-          <w:bCs/>
-          <w:b/>
-        </w:rPr>
-        <w:t xml:space="preserve">258 decision documents across 193 projects</w:t>
-      </w:r>
-      <w:r>
-        <w:t xml:space="preserve">. Every rate below describes</w:t>
-      </w:r>
-      <w:r>
-        <w:t xml:space="preserve"> </w:t>
-      </w:r>
-      <w:r>
-        <w:rPr>
-          <w:iCs/>
-          <w:i/>
-        </w:rPr>
-        <w:t xml:space="preserve">those</w:t>
-      </w:r>
-      <w:r>
-        <w:t xml:space="preserve"> </w:t>
-      </w:r>
-      <w:r>
-        <w:t xml:space="preserve">documents, not the full corpus; the reduction is a coverage limitation (some documents phrase their finding in wording the extraction does not recognize), not a different finding.</w:t>
+        <w:t xml:space="preserve">The FONSI analysis rests on the decarbonization FONSIs that are led by BLM or the Department of Energy family and carry machine-extractable significance findings — 258 decision documents across 193 projects. Every rate below describes those documents, not the full corpus; the reduction is a coverage limitation (some documents phrase their finding in wording the extraction does not recognize), not a different finding.</w:t>
       </w:r>
     </w:p>
     <w:p>
@@ -1324,23 +955,7 @@
         <w:pStyle w:val="BodyText"/>
       </w:pPr>
       <w:r>
-        <w:t xml:space="preserve">Accuracy is measured against the AI-human answer key on a held-out test. The extraction almost never misses a determination, places it in the right resource area about 89% of the time, and agrees with the answer key on the significance</w:t>
-      </w:r>
-      <w:r>
-        <w:t xml:space="preserve"> </w:t>
-      </w:r>
-      <w:r>
-        <w:rPr>
-          <w:iCs/>
-          <w:i/>
-        </w:rPr>
-        <w:t xml:space="preserve">class</w:t>
-      </w:r>
-      <w:r>
-        <w:t xml:space="preserve"> </w:t>
-      </w:r>
-      <w:r>
-        <w:t xml:space="preserve">at 0.81 — the standard bar for this kind of task. The three signals that carry the findings — finding the determination, placing the resource, and getting the class — all clear or approach that bar.</w:t>
+        <w:t xml:space="preserve">Accuracy is measured against the AI-human answer key on a held-out test. The extraction almost never misses a determination, places it in the right resource area about 89% of the time, and agrees with the answer key on the significance class at 0.81, the standard bar for this kind of task. The three signals that carry the findings — finding the determination, placing the resource, and getting the class — all clear or approach that bar.</w:t>
       </w:r>
     </w:p>
     <w:bookmarkEnd w:id="30"/>
@@ -1358,7 +973,7 @@
         <w:pStyle w:val="FirstParagraph"/>
       </w:pPr>
       <w:r>
-        <w:t xml:space="preserve">Within FONSIs the determinations sit — almost without exception — below the significance line: the agency either finds no significant impact outright or an impact that is less than significant, sometimes only with committed mitigation. The dominant outcome is no significant impact, as expected. But the resources agencies analyze most — biological, water, cultural/historic — are also where the close calls concentrate: the committed-mitigation band is widest for biological, soils/geology, and water.</w:t>
+        <w:t xml:space="preserve">Within FONSIs the determinations sit, almost without exception, below the significance line: the agency either finds no significant impact outright or an impact that is less than significant, sometimes only with committed mitigation. The dominant outcome is no significant impact, as expected. But the resources agencies analyze most — biological, water, cultural/historic — are also where the close calls concentrate: the committed-mitigation band is widest for biological, soils/geology, and water.</w:t>
       </w:r>
     </w:p>
     <w:tbl>
@@ -1454,39 +1069,7 @@
         <w:pStyle w:val="FirstParagraph"/>
       </w:pPr>
       <w:r>
-        <w:t xml:space="preserve">The most revealing determinations are the mitigated ones: impacts the agency says</w:t>
-      </w:r>
-      <w:r>
-        <w:t xml:space="preserve"> </w:t>
-      </w:r>
-      <w:r>
-        <w:rPr>
-          <w:iCs/>
-          <w:i/>
-        </w:rPr>
-        <w:t xml:space="preserve">would</w:t>
-      </w:r>
-      <w:r>
-        <w:t xml:space="preserve"> </w:t>
-      </w:r>
-      <w:r>
-        <w:t xml:space="preserve">be significant, brought below the line only by required measures. They show exactly where the line sits and what it costs to stay under it — and they are the</w:t>
-      </w:r>
-      <w:r>
-        <w:t xml:space="preserve"> </w:t>
-      </w:r>
-      <w:r>
-        <w:rPr>
-          <w:bCs/>
-          <w:b/>
-        </w:rPr>
-        <w:t xml:space="preserve">majority</w:t>
-      </w:r>
-      <w:r>
-        <w:t xml:space="preserve"> </w:t>
-      </w:r>
-      <w:r>
-        <w:t xml:space="preserve">of FONSIs. About 58% of the analyzed FONSI documents are mitigated: at least one resource whose not-significant conclusion depends explicitly on committed mitigation.</w:t>
+        <w:t xml:space="preserve">The most revealing determinations are the mitigated ones: impacts the agency says would be significant, brought below the line only by required measures. They show exactly where the line sits and what it costs to stay under it, and they are the majority of FONSIs. About 58% of the analyzed FONSI documents are mitigated, with at least one resource whose not-significant conclusion depends explicitly on committed mitigation.</w:t>
       </w:r>
     </w:p>
     <w:tbl>
@@ -1572,55 +1155,7 @@
         <w:pStyle w:val="BodyText"/>
       </w:pPr>
       <w:r>
-        <w:t xml:space="preserve">The mitigation burden is concentrated in a few resources —</w:t>
-      </w:r>
-      <w:r>
-        <w:t xml:space="preserve"> </w:t>
-      </w:r>
-      <w:r>
-        <w:rPr>
-          <w:bCs/>
-          <w:b/>
-        </w:rPr>
-        <w:t xml:space="preserve">biological (30%), soils / geology (28%), water (26%), cultural / historic (22%)</w:t>
-      </w:r>
-      <w:r>
-        <w:t xml:space="preserve"> </w:t>
-      </w:r>
-      <w:r>
-        <w:t xml:space="preserve">— the areas where decarbonization projects most frequently sit</w:t>
-      </w:r>
-      <w:r>
-        <w:t xml:space="preserve"> </w:t>
-      </w:r>
-      <w:r>
-        <w:rPr>
-          <w:iCs/>
-          <w:i/>
-        </w:rPr>
-        <w:t xml:space="preserve">at</w:t>
-      </w:r>
-      <w:r>
-        <w:t xml:space="preserve"> </w:t>
-      </w:r>
-      <w:r>
-        <w:t xml:space="preserve">the line and are pulled under it by mitigation. Reading volume and mitigation-intensity together sharpens the picture: biological resources dominate both axes (analyzed often</w:t>
-      </w:r>
-      <w:r>
-        <w:t xml:space="preserve"> </w:t>
-      </w:r>
-      <w:r>
-        <w:rPr>
-          <w:iCs/>
-          <w:i/>
-        </w:rPr>
-        <w:t xml:space="preserve">and</w:t>
-      </w:r>
-      <w:r>
-        <w:t xml:space="preserve"> </w:t>
-      </w:r>
-      <w:r>
-        <w:t xml:space="preserve">mitigated often), while soils/geology are mitigated intensively despite lower volume.</w:t>
+        <w:t xml:space="preserve">The mitigation burden is concentrated in a few resources — biological (30%), soils / geology (28%), water (26%), cultural / historic (22%) — the areas where decarbonization projects most frequently sit at the line and are pulled under it by mitigation. Reading volume and mitigation-intensity together sharpens the picture: biological resources dominate both axes (analyzed often and mitigated often), while soils/geology are mitigated intensively despite lower volume.</w:t>
       </w:r>
     </w:p>
     <w:tbl>
@@ -1792,36 +1327,7 @@
         <w:pStyle w:val="BodyText"/>
       </w:pPr>
       <w:r>
-        <w:t xml:space="preserve">A second, independent line of evidence confirms the pattern. For each flagged effect we can look at the committed mitigation conditions nearby and ask whether any addresses the</w:t>
-      </w:r>
-      <w:r>
-        <w:t xml:space="preserve"> </w:t>
-      </w:r>
-      <w:r>
-        <w:rPr>
-          <w:iCs/>
-          <w:i/>
-        </w:rPr>
-        <w:t xml:space="preserve">same resource area</w:t>
-      </w:r>
-      <w:r>
-        <w:t xml:space="preserve"> </w:t>
-      </w:r>
-      <w:r>
-        <w:t xml:space="preserve">— a direct join between an impact and a commitment. On that basis,</w:t>
-      </w:r>
-      <w:r>
-        <w:t xml:space="preserve"> </w:t>
-      </w:r>
-      <w:r>
-        <w:rPr>
-          <w:bCs/>
-          <w:b/>
-        </w:rPr>
-        <w:t xml:space="preserve">23% of flagged FONSI determinations are matched to at least one same-resource mitigation condition</w:t>
-      </w:r>
-      <w:r>
-        <w:t xml:space="preserve">, concentrated in the same areas as the class signal. (The match rule is deliberately inclusive, so read this as an aggregate map of which resources recurringly attract same-resource mitigation, not a per-project ruling.)</w:t>
+        <w:t xml:space="preserve">A second, independent line of evidence confirms the pattern. For each flagged effect we can look at the committed mitigation conditions nearby and ask whether any addresses the same resource area — a direct join between an impact and a commitment. On that basis, 23% of flagged FONSI determinations are matched to at least one same-resource mitigation condition, concentrated in the same areas as the class signal. (The match rule is deliberately inclusive, so read this as an aggregate map of which resources recurringly attract same-resource mitigation, not a per-project ruling.)</w:t>
       </w:r>
     </w:p>
     <w:p>
@@ -2170,13 +1676,13 @@
       </w:tr>
     </w:tbl>
     <w:bookmarkEnd w:id="48"/>
-    <w:bookmarkStart w:id="57" w:name="Xd5143aed43b8c421473033ddfb700edaefe51e7"/>
+    <w:bookmarkStart w:id="57" w:name="X2a5689cc350e6d97efe668cb4a83f10cda06739"/>
     <w:p>
       <w:pPr>
         <w:pStyle w:val="Heading3"/>
       </w:pPr>
       <w:r>
-        <w:t xml:space="preserve">Does mitigation differ by agency and technology?</w:t>
+        <w:t xml:space="preserve">Mitigation drivers differ by agency and technology</w:t>
       </w:r>
     </w:p>
     <w:p>
@@ -2184,39 +1690,7 @@
         <w:pStyle w:val="FirstParagraph"/>
       </w:pPr>
       <w:r>
-        <w:t xml:space="preserve">BLM and the DOE family run different kinds of projects, so the resources that push them to mitigate differ too. Biological, cultural/historic, air quality, and visual resources drive mitigation harder for</w:t>
-      </w:r>
-      <w:r>
-        <w:t xml:space="preserve"> </w:t>
-      </w:r>
-      <w:r>
-        <w:rPr>
-          <w:bCs/>
-          <w:b/>
-        </w:rPr>
-        <w:t xml:space="preserve">BLM</w:t>
-      </w:r>
-      <w:r>
-        <w:t xml:space="preserve"> </w:t>
-      </w:r>
-      <w:r>
-        <w:t xml:space="preserve">(land-facing impacts on habitat, historic sites, and viewsheds), while noise and water lean toward the</w:t>
-      </w:r>
-      <w:r>
-        <w:t xml:space="preserve"> </w:t>
-      </w:r>
-      <w:r>
-        <w:rPr>
-          <w:bCs/>
-          <w:b/>
-        </w:rPr>
-        <w:t xml:space="preserve">DOE family</w:t>
-      </w:r>
-      <w:r>
-        <w:t xml:space="preserve"> </w:t>
-      </w:r>
-      <w:r>
-        <w:t xml:space="preserve">(facility- and construction-driven effects).</w:t>
+        <w:t xml:space="preserve">BLM and the DOE family run different kinds of projects, so the resources that push them to mitigate differ too. Biological, cultural/historic, air quality, and visual resources drive mitigation harder for BLM (land-facing impacts on habitat, historic sites, and viewsheds), while noise and water lean toward the DOE family (facility- and construction-driven effects).</w:t>
       </w:r>
     </w:p>
     <w:tbl>
@@ -2302,23 +1776,7 @@
         <w:pStyle w:val="BodyText"/>
       </w:pPr>
       <w:r>
-        <w:t xml:space="preserve">The project type matters as much as the agency.</w:t>
-      </w:r>
-      <w:r>
-        <w:t xml:space="preserve"> </w:t>
-      </w:r>
-      <w:r>
-        <w:rPr>
-          <w:bCs/>
-          <w:b/>
-        </w:rPr>
-        <w:t xml:space="preserve">Transmission and wind lean hardest on mitigation</w:t>
-      </w:r>
-      <w:r>
-        <w:t xml:space="preserve"> </w:t>
-      </w:r>
-      <w:r>
-        <w:t xml:space="preserve">— linear corridors and turbine sites touch habitat, viewsheds, and cultural resources that repeatedly need committed measures to reach a not-significant finding. Solar and storage sit lower, closer to the corpus average.</w:t>
+        <w:t xml:space="preserve">The project type matters as much as the agency. Transmission and wind lean hardest on mitigation: linear corridors and turbine sites touch habitat, viewsheds, and cultural resources that repeatedly need committed measures to reach a not-significant finding. Solar and storage sit lower, closer to the corpus average.</w:t>
       </w:r>
     </w:p>
     <w:tbl>
@@ -2418,13 +1876,13 @@
       </w:tr>
     </w:tbl>
     <w:bookmarkEnd w:id="57"/>
-    <w:bookmarkStart w:id="62" w:name="is-the-committed-mitigation-enforceable"/>
+    <w:bookmarkStart w:id="62" w:name="enforceability-of-committed-mitigation"/>
     <w:p>
       <w:pPr>
         <w:pStyle w:val="Heading3"/>
       </w:pPr>
       <w:r>
-        <w:t xml:space="preserve">Is the committed mitigation enforceable?</w:t>
+        <w:t xml:space="preserve">Enforceability of committed mitigation</w:t>
       </w:r>
     </w:p>
     <w:p>
@@ -2444,23 +1902,7 @@
         <w:t xml:space="preserve"> </w:t>
       </w:r>
       <w:r>
-        <w:t xml:space="preserve">only means something if the measures are actually required. The extraction flags whether each mitigated conclusion is tied to an</w:t>
-      </w:r>
-      <w:r>
-        <w:t xml:space="preserve"> </w:t>
-      </w:r>
-      <w:r>
-        <w:rPr>
-          <w:bCs/>
-          <w:b/>
-        </w:rPr>
-        <w:t xml:space="preserve">enforceable permit condition</w:t>
-      </w:r>
-      <w:r>
-        <w:t xml:space="preserve"> </w:t>
-      </w:r>
-      <w:r>
-        <w:t xml:space="preserve">or committed only in the document’s text. The pattern tracks regulatory leverage: biological, air-quality, and water conclusions — backed by the Endangered Species Act and the Clean Air and Water Acts — most often carry an enforceable condition. Visual, cultural, and soils measures are far less often tied to one.</w:t>
+        <w:t xml:space="preserve">only means something if the measures are actually required. The extraction flags whether each mitigated conclusion is tied to an enforceable permit condition or committed only in the document’s text. The pattern tracks regulatory leverage: biological, air-quality, and water conclusions — backed by the Endangered Species Act and the Clean Air and Water Acts — most often carry an enforceable condition. Visual, cultural, and soils measures are far less often tied to one.</w:t>
       </w:r>
     </w:p>
     <w:tbl>
@@ -2546,7 +1988,7 @@
         <w:pStyle w:val="BodyText"/>
       </w:pPr>
       <w:r>
-        <w:t xml:space="preserve">So for the softer resources, the mitigation behind a not-significant finding is the least demonstrably binding — a caveat worth carrying into how much weight the</w:t>
+        <w:t xml:space="preserve">So for the softer resources, the mitigation behind a not-significant finding is the least demonstrably binding, a caveat worth carrying into how much weight the</w:t>
       </w:r>
       <w:r>
         <w:t xml:space="preserve"> </w:t>
@@ -2593,138 +2035,51 @@
         <w:pStyle w:val="FirstParagraph"/>
       </w:pPr>
       <w:r>
-        <w:t xml:space="preserve">The EIS track is the mirror of the FONSI track — the above-the-line record of where impacts actually cross the significance line. It runs the identical extraction-and-validation machinery, but covers</w:t>
+        <w:t xml:space="preserve">The EIS track is the mirror of the FONSI track — the above-the-line record of where impacts actually cross the significance line. It runs the identical extraction-and-validation machinery, but covers all lead agencies (not just BLM + DOE) because it is purely descriptive and never uses a project’s decision date. On that basis it rests on 506 projects (1,082 documents) carrying 13,240 distinct determinations, of which 2,198 land above the line, including 698 judged significant and unavoidable, impacts mitigation cannot erase.</w:t>
+      </w:r>
+    </w:p>
+    <w:p>
+      <w:pPr>
+        <w:pStyle w:val="BodyText"/>
+      </w:pPr>
+      <w:r>
+        <w:t xml:space="preserve">The EIS scores run lower than the FONSI track across the board: the pipeline finds the determination reliably (0.84) and lands the significance class at 0.69. That is a real reflection of difficulty: separating</w:t>
       </w:r>
       <w:r>
         <w:t xml:space="preserve"> </w:t>
       </w:r>
       <w:r>
-        <w:rPr>
-          <w:bCs/>
-          <w:b/>
-        </w:rPr>
-        <w:t xml:space="preserve">all</w:t>
+        <w:t xml:space="preserve">“</w:t>
+      </w:r>
+      <w:r>
+        <w:t xml:space="preserve">significant</w:t>
+      </w:r>
+      <w:r>
+        <w:t xml:space="preserve">”</w:t>
       </w:r>
       <w:r>
         <w:t xml:space="preserve"> </w:t>
       </w:r>
       <w:r>
-        <w:t xml:space="preserve">lead agencies (not just BLM + DOE) because it is purely descriptive and never uses a project’s decision date. On that basis it rests on</w:t>
+        <w:t xml:space="preserve">from</w:t>
       </w:r>
       <w:r>
         <w:t xml:space="preserve"> </w:t>
       </w:r>
       <w:r>
-        <w:rPr>
-          <w:bCs/>
-          <w:b/>
-        </w:rPr>
-        <w:t xml:space="preserve">506 projects (1,082 documents)</w:t>
+        <w:t xml:space="preserve">“</w:t>
+      </w:r>
+      <w:r>
+        <w:t xml:space="preserve">significant and unavoidable</w:t>
+      </w:r>
+      <w:r>
+        <w:t xml:space="preserve">”</w:t>
       </w:r>
       <w:r>
         <w:t xml:space="preserve"> </w:t>
       </w:r>
       <w:r>
-        <w:t xml:space="preserve">carrying 13,240 distinct determinations — of which 2,198 land above the line, including 698 judged significant</w:t>
-      </w:r>
-      <w:r>
-        <w:t xml:space="preserve"> </w:t>
-      </w:r>
-      <w:r>
-        <w:rPr>
-          <w:iCs/>
-          <w:i/>
-        </w:rPr>
-        <w:t xml:space="preserve">and unavoidable</w:t>
-      </w:r>
-      <w:r>
-        <w:t xml:space="preserve">, impacts mitigation cannot erase.</w:t>
-      </w:r>
-    </w:p>
-    <w:p>
-      <w:pPr>
-        <w:pStyle w:val="BodyText"/>
-      </w:pPr>
-      <w:r>
-        <w:t xml:space="preserve">The EIS scores run lower than the FONSI track across the board — the pipeline finds the determination reliably (0.84) and lands the significance</w:t>
-      </w:r>
-      <w:r>
-        <w:t xml:space="preserve"> </w:t>
-      </w:r>
-      <w:r>
-        <w:rPr>
-          <w:iCs/>
-          <w:i/>
-        </w:rPr>
-        <w:t xml:space="preserve">class</w:t>
-      </w:r>
-      <w:r>
-        <w:t xml:space="preserve"> </w:t>
-      </w:r>
-      <w:r>
-        <w:t xml:space="preserve">at 0.69. That is a real reflection of difficulty: separating</w:t>
-      </w:r>
-      <w:r>
-        <w:t xml:space="preserve"> </w:t>
-      </w:r>
-      <w:r>
-        <w:t xml:space="preserve">“</w:t>
-      </w:r>
-      <w:r>
-        <w:t xml:space="preserve">significant</w:t>
-      </w:r>
-      <w:r>
-        <w:t xml:space="preserve">”</w:t>
-      </w:r>
-      <w:r>
-        <w:t xml:space="preserve"> </w:t>
-      </w:r>
-      <w:r>
-        <w:t xml:space="preserve">from</w:t>
-      </w:r>
-      <w:r>
-        <w:t xml:space="preserve"> </w:t>
-      </w:r>
-      <w:r>
-        <w:t xml:space="preserve">“</w:t>
-      </w:r>
-      <w:r>
-        <w:t xml:space="preserve">significant</w:t>
-      </w:r>
-      <w:r>
-        <w:t xml:space="preserve"> </w:t>
-      </w:r>
-      <w:r>
-        <w:rPr>
-          <w:iCs/>
-          <w:i/>
-        </w:rPr>
-        <w:t xml:space="preserve">and unavoidable</w:t>
-      </w:r>
-      <w:r>
-        <w:t xml:space="preserve">”</w:t>
-      </w:r>
-      <w:r>
-        <w:t xml:space="preserve"> </w:t>
-      </w:r>
-      <w:r>
-        <w:t xml:space="preserve">is a fine distinction the AI coders split on too. We therefore lead with the robust cut —</w:t>
-      </w:r>
-      <w:r>
-        <w:t xml:space="preserve"> </w:t>
-      </w:r>
-      <w:r>
-        <w:rPr>
-          <w:iCs/>
-          <w:i/>
-        </w:rPr>
-        <w:t xml:space="preserve">which resources cross the line</w:t>
-      </w:r>
-      <w:r>
-        <w:t xml:space="preserve"> </w:t>
-      </w:r>
-      <w:r>
-        <w:t xml:space="preserve">— and treat the adverse-vs-unavoidable split as directional.</w:t>
+        <w:t xml:space="preserve">is a fine distinction the AI coders split on too. We therefore lead with the more reliable cut — which resources cross the line — and treat the adverse-vs-unavoidable split as directional.</w:t>
       </w:r>
     </w:p>
     <w:bookmarkEnd w:id="65"/>
@@ -2742,23 +2097,7 @@
         <w:pStyle w:val="FirstParagraph"/>
       </w:pPr>
       <w:r>
-        <w:t xml:space="preserve">Ranking each resource by how often its EIS conclusions are judged significant,</w:t>
-      </w:r>
-      <w:r>
-        <w:t xml:space="preserve"> </w:t>
-      </w:r>
-      <w:r>
-        <w:rPr>
-          <w:bCs/>
-          <w:b/>
-        </w:rPr>
-        <w:t xml:space="preserve">visual (33%) stands alone at the top</w:t>
-      </w:r>
-      <w:r>
-        <w:t xml:space="preserve"> </w:t>
-      </w:r>
-      <w:r>
-        <w:t xml:space="preserve">— the clearest case of an impact that, once significant, tends to stay that way. cultural / historic (24%), biological (21%), and land use (18%) follow.</w:t>
+        <w:t xml:space="preserve">Ranking each resource by how often its EIS conclusions are judged significant, visual (33%) stands alone at the top, the clearest case of an impact that, once significant, tends to stay that way. cultural / historic (24%), biological (21%), and land use (18%) follow.</w:t>
       </w:r>
     </w:p>
     <w:tbl>
@@ -2844,36 +2183,7 @@
         <w:pStyle w:val="BodyText"/>
       </w:pPr>
       <w:r>
-        <w:t xml:space="preserve">The starkest determinations are the significant</w:t>
-      </w:r>
-      <w:r>
-        <w:t xml:space="preserve"> </w:t>
-      </w:r>
-      <w:r>
-        <w:rPr>
-          <w:iCs/>
-          <w:i/>
-        </w:rPr>
-        <w:t xml:space="preserve">and unavoidable</w:t>
-      </w:r>
-      <w:r>
-        <w:t xml:space="preserve"> </w:t>
-      </w:r>
-      <w:r>
-        <w:t xml:space="preserve">ones — where the agency concludes the impact is real, material, and cannot be mitigated below the line. These are the true limits on a decarbonization project.</w:t>
-      </w:r>
-      <w:r>
-        <w:t xml:space="preserve"> </w:t>
-      </w:r>
-      <w:r>
-        <w:rPr>
-          <w:bCs/>
-          <w:b/>
-        </w:rPr>
-        <w:t xml:space="preserve">Visual impacts dominate this wall</w:t>
-      </w:r>
-      <w:r>
-        <w:t xml:space="preserve">: a wind farm on a ridgeline or a transmission corridor across open country changes a landscape in ways no mitigation fully undoes. Biological, cultural, and air-quality impacts follow.</w:t>
+        <w:t xml:space="preserve">The starkest determinations are the significant and unavoidable ones, where the agency concludes the impact is real, material, and cannot be mitigated below the line. These are the true limits on a decarbonization project. Visual impacts dominate this category: a wind farm on a ridgeline or a transmission corridor across open country changes a landscape in ways no mitigation fully undoes. Biological, cultural, and air-quality impacts follow.</w:t>
       </w:r>
     </w:p>
     <w:tbl>
@@ -3327,13 +2637,13 @@
     </w:tbl>
     <w:bookmarkEnd w:id="74"/>
     <w:bookmarkEnd w:id="75"/>
-    <w:bookmarkStart w:id="80" w:name="how-broadly-does-an-eis-cross-the-line"/>
+    <w:bookmarkStart w:id="80" w:name="how-broadly-an-eis-crosses-the-line"/>
     <w:p>
       <w:pPr>
         <w:pStyle w:val="Heading2"/>
       </w:pPr>
       <w:r>
-        <w:t xml:space="preserve">How broadly does an EIS cross the line?</w:t>
+        <w:t xml:space="preserve">How broadly an EIS crosses the line</w:t>
       </w:r>
     </w:p>
     <w:p>
@@ -3341,23 +2651,7 @@
         <w:pStyle w:val="FirstParagraph"/>
       </w:pPr>
       <w:r>
-        <w:t xml:space="preserve">Stepping back to the document level asks a different question: when an EIS</w:t>
-      </w:r>
-      <w:r>
-        <w:t xml:space="preserve"> </w:t>
-      </w:r>
-      <w:r>
-        <w:rPr>
-          <w:iCs/>
-          <w:i/>
-        </w:rPr>
-        <w:t xml:space="preserve">does</w:t>
-      </w:r>
-      <w:r>
-        <w:t xml:space="preserve"> </w:t>
-      </w:r>
-      <w:r>
-        <w:t xml:space="preserve">cross the line, does it do so on one resource or many? Crossing is usually a focused event — over a third of EISs that cross do so on a single resource, and the median is two. But a meaningful minority cross on three or more resources, and a few span nearly the entire environmental slate.</w:t>
+        <w:t xml:space="preserve">At the document level a different question comes into view: when an EIS does cross the line, does it do so on one resource or many? Crossing is usually a focused event — over a third of EISs that cross do so on a single resource, and the median is two. But a meaningful minority cross on three or more resources, and a few span nearly the entire environmental slate.</w:t>
       </w:r>
     </w:p>
     <w:tbl>
@@ -3453,7 +2747,7 @@
         <w:pStyle w:val="FirstParagraph"/>
       </w:pPr>
       <w:r>
-        <w:t xml:space="preserve">Analyzing the two tracks separately pays off in one picture, which plots each resource by how often it is mitigated below the line (FONSIs) against how often it crosses the line (EISs). Both tracks are restricted to BLM + DOE here, so the two are measured on the same footing. The split is the deliverable’s sharpest structural finding:</w:t>
+        <w:t xml:space="preserve">Analyzing the two tracks separately pays off in one picture, which plots each resource by how often it is mitigated below the line (FONSIs) against how often it crosses the line (EISs). Both tracks are restricted to BLM + DOE here, so the two are measured on the same footing. This split, mitigated below the line in FONSIs versus crossing above it in EISs, is one of the clearest structural patterns in the analysis:</w:t>
       </w:r>
     </w:p>
     <w:tbl>
@@ -3536,68 +2830,10 @@
     </w:tbl>
     <w:p>
       <w:pPr>
-        <w:numPr>
-          <w:ilvl w:val="0"/>
-          <w:numId w:val="1002"/>
-        </w:numPr>
-        <w:pStyle w:val="Compact"/>
-      </w:pPr>
-      <w:r>
-        <w:rPr>
-          <w:bCs/>
-          <w:b/>
-        </w:rPr>
-        <w:t xml:space="preserve">More likely to be significant</w:t>
-      </w:r>
-      <w:r>
-        <w:t xml:space="preserve"> </w:t>
-      </w:r>
-      <w:r>
-        <w:t xml:space="preserve">— visual, land use, air quality — break above the line more often than they are mitigated below it. When these become a problem, agencies more often accept a significant finding than engineer their way under it; visual is the extreme.</w:t>
-      </w:r>
-    </w:p>
-    <w:p>
-      <w:pPr>
-        <w:numPr>
-          <w:ilvl w:val="0"/>
-          <w:numId w:val="1002"/>
-        </w:numPr>
-        <w:pStyle w:val="Compact"/>
-      </w:pPr>
-      <w:r>
-        <w:rPr>
-          <w:bCs/>
-          <w:b/>
-        </w:rPr>
-        <w:t xml:space="preserve">More likely to be mitigated</w:t>
-      </w:r>
-      <w:r>
-        <w:t xml:space="preserve"> </w:t>
-      </w:r>
-      <w:r>
-        <w:t xml:space="preserve">— soils/geology, water, public health — show the opposite: frequently mitigated in FONSIs, rarely crossing into significance. These are the impacts the toolbox of committed measures reliably handles.</w:t>
-      </w:r>
-    </w:p>
-    <w:p>
-      <w:pPr>
-        <w:numPr>
-          <w:ilvl w:val="0"/>
-          <w:numId w:val="1002"/>
-        </w:numPr>
-        <w:pStyle w:val="Compact"/>
-      </w:pPr>
-      <w:r>
-        <w:rPr>
-          <w:bCs/>
-          <w:b/>
-        </w:rPr>
-        <w:t xml:space="preserve">Cultural / historic sits right on the line</w:t>
-      </w:r>
-      <w:r>
-        <w:t xml:space="preserve"> </w:t>
-      </w:r>
-      <w:r>
-        <w:t xml:space="preserve">— it crosses into significance about as often as it is mitigated below it, the one resource that genuinely straddles both sides.</w:t>
+        <w:pStyle w:val="BodyText"/>
+      </w:pPr>
+      <w:r>
+        <w:t xml:space="preserve">Three shapes emerge. Visual, land use, and air quality break above the line more often than they are mitigated below it: when these become a problem, agencies more often accept a significant finding than engineer their way under it, with visual the extreme. Soils/geology, water, and public health show the opposite, frequently mitigated in FONSIs and rarely crossing into significance — the impacts the toolbox of committed measures reliably handles. Cultural/historic sits right on the line, crossing into significance about as often as it is mitigated below it, the one resource that genuinely straddles both sides.</w:t>
       </w:r>
     </w:p>
     <w:bookmarkEnd w:id="85"/>
@@ -3615,23 +2851,7 @@
         <w:pStyle w:val="FirstParagraph"/>
       </w:pPr>
       <w:r>
-        <w:t xml:space="preserve">For every above-the-line determination the extraction also records</w:t>
-      </w:r>
-      <w:r>
-        <w:t xml:space="preserve"> </w:t>
-      </w:r>
-      <w:r>
-        <w:rPr>
-          <w:iCs/>
-          <w:i/>
-        </w:rPr>
-        <w:t xml:space="preserve">why</w:t>
-      </w:r>
-      <w:r>
-        <w:t xml:space="preserve"> </w:t>
-      </w:r>
-      <w:r>
-        <w:t xml:space="preserve">it is significant. The leading reasons are sheer magnitude, a protected resource, and cumulative effects — and they are not interchangeable: a protected resource drives significance mainly for cultural and biological resources (endangered species, historic properties), a regulatory threshold for air quality and noise (numeric standards), and cumulative effects for biological, visual, and water. That last one is notable for decarbonization siting — roughly one in four significant findings rests on impacts that build up across a landscape or airshed rather than on one project’s direct footprint.</w:t>
+        <w:t xml:space="preserve">For every above-the-line determination the extraction also records why it is significant. The leading reasons are sheer magnitude, a protected resource, and cumulative effects — and they are not interchangeable: a protected resource drives significance mainly for cultural and biological resources (endangered species, historic properties), a regulatory threshold for air quality and noise (numeric standards), and cumulative effects for biological, visual, and water. That last one is notable for decarbonization siting — roughly one in four significant findings rests on impacts that build up across a landscape or airshed rather than on one project’s direct footprint.</w:t>
       </w:r>
     </w:p>
     <w:tbl>
@@ -4007,13 +3227,13 @@
     </w:tbl>
     <w:bookmarkEnd w:id="90"/>
     <w:bookmarkEnd w:id="91"/>
-    <w:bookmarkStart w:id="96" w:name="does-it-differ-by-agency"/>
+    <w:bookmarkStart w:id="96" w:name="significance-rates-differ-by-lead-agency"/>
     <w:p>
       <w:pPr>
         <w:pStyle w:val="Heading2"/>
       </w:pPr>
       <w:r>
-        <w:t xml:space="preserve">Does it differ by agency?</w:t>
+        <w:t xml:space="preserve">Significance rates differ by lead agency</w:t>
       </w:r>
     </w:p>
     <w:p>
@@ -4117,55 +3337,7 @@
         <w:pStyle w:val="FirstParagraph"/>
       </w:pPr>
       <w:r>
-        <w:t xml:space="preserve">The most decision-relevant cut for a decarbonization portfolio is the technology.</w:t>
-      </w:r>
-      <w:r>
-        <w:t xml:space="preserve"> </w:t>
-      </w:r>
-      <w:r>
-        <w:rPr>
-          <w:bCs/>
-          <w:b/>
-        </w:rPr>
-        <w:t xml:space="preserve">Hydro crosses the line most</w:t>
-      </w:r>
-      <w:r>
-        <w:t xml:space="preserve"> </w:t>
-      </w:r>
-      <w:r>
-        <w:t xml:space="preserve">(28%) — dams carry aquatic and water impacts that are hard to avoid — followed by transmission and solar.</w:t>
-      </w:r>
-      <w:r>
-        <w:t xml:space="preserve"> </w:t>
-      </w:r>
-      <w:r>
-        <w:rPr>
-          <w:bCs/>
-          <w:b/>
-        </w:rPr>
-        <w:t xml:space="preserve">Nuclear crosses least among the large technologies</w:t>
-      </w:r>
-      <w:r>
-        <w:t xml:space="preserve"> </w:t>
-      </w:r>
-      <w:r>
-        <w:t xml:space="preserve">(6%), consistent with siting on already-industrial land under highly prescribed review. But the</w:t>
-      </w:r>
-      <w:r>
-        <w:t xml:space="preserve"> </w:t>
-      </w:r>
-      <w:r>
-        <w:rPr>
-          <w:iCs/>
-          <w:i/>
-        </w:rPr>
-        <w:t xml:space="preserve">rate</w:t>
-      </w:r>
-      <w:r>
-        <w:t xml:space="preserve"> </w:t>
-      </w:r>
-      <w:r>
-        <w:t xml:space="preserve">is only half the story; the resources each technology hits are distinct, and largely predictable: wind’s fight is about wildlife (avian and bat collision) and noise; solar’s is visual, cultural, and air quality; transmission spreads across biological, visual, and cultural along its corridor.</w:t>
+        <w:t xml:space="preserve">The most decision-relevant cut for a decarbonization portfolio is the technology. Hydro crosses the line most (28%), as dams carry aquatic and water impacts that are hard to avoid, followed by transmission and solar. Nuclear crosses least among the large technologies (6%), consistent with siting on already-industrial land under highly prescribed review. But the rate is only half the story; the resources each technology hits are distinct, and largely predictable: wind’s fight is about wildlife (avian and bat collision) and noise; solar’s is visual, cultural, and air quality; transmission spreads across biological, visual, and cultural along its corridor.</w:t>
       </w:r>
     </w:p>
     <w:tbl>
@@ -4279,23 +3451,7 @@
         <w:pStyle w:val="FirstParagraph"/>
       </w:pPr>
       <w:r>
-        <w:t xml:space="preserve">Not every above-the-line finding is a hard stop. One significance factor the extraction records is</w:t>
-      </w:r>
-      <w:r>
-        <w:t xml:space="preserve"> </w:t>
-      </w:r>
-      <w:r>
-        <w:rPr>
-          <w:bCs/>
-          <w:b/>
-        </w:rPr>
-        <w:t xml:space="preserve">mitigable</w:t>
-      </w:r>
-      <w:r>
-        <w:t xml:space="preserve"> </w:t>
-      </w:r>
-      <w:r>
-        <w:t xml:space="preserve">— the impact crosses the line, but the agency notes that measures can still lessen it. This is the EIS analog of a mitigated FONSI. Tellingly, visual leads this list too: even the resource most likely to hit the wall sometimes admits partial mitigation (screening, siting adjustments), just not enough to drop below the line.</w:t>
+        <w:t xml:space="preserve">Not every above-the-line finding is a hard stop. One significance factor the extraction records is mitigable — the impact crosses the line, but the agency notes that measures can still lessen it. This is the EIS analog of a mitigated FONSI. Visual leads this list too: even the resource most likely to cross the line sometimes admits partial mitigation (screening, siting adjustments), just not enough to drop below it.</w:t>
       </w:r>
     </w:p>
     <w:tbl>
@@ -4396,7 +3552,7 @@
           <w:bCs/>
           <w:b/>
         </w:rPr>
-        <w:t xml:space="preserve">Mitigation plays an enormous role in whether an impact is called significant.</w:t>
+        <w:t xml:space="preserve">Mitigation plays a central role in whether an impact is called significant.</w:t>
       </w:r>
       <w:r>
         <w:t xml:space="preserve"> </w:t>
@@ -4428,65 +3584,33 @@
         <w:pStyle w:val="BodyText"/>
       </w:pPr>
       <w:r>
-        <w:t xml:space="preserve">First, the uneven mitigation pattern is itself an opportunity. Where agencies have a deep, repeatable toolbox — habitat timing windows, wetland minimization, cultural-resource protection — impacts that would otherwise be significant are routinely brought under the line. The resources that cross most (visual above all) are precisely the ones where the mitigation toolbox is thinnest.</w:t>
+        <w:t xml:space="preserve">First, the uneven mitigation pattern is itself an opportunity. Where agencies have a deep, repeatable toolbox — habitat timing windows, wetland minimization, cultural-resource protection — impacts that would otherwise be significant are routinely brought under the line. The resources that cross most (visual above all) are precisely the ones where the mitigation toolbox is thinnest. Increased investment in, and standardization of, mitigation approaches for those harder resources could keep more projects on the faster FONSI track, provided the measures genuinely reduce impact rather than relabel it.</w:t>
+      </w:r>
+    </w:p>
+    <w:p>
+      <w:pPr>
+        <w:pStyle w:val="BodyText"/>
+      </w:pPr>
+      <w:r>
+        <w:t xml:space="preserve">Second, a caveat that limits how far the</w:t>
       </w:r>
       <w:r>
         <w:t xml:space="preserve"> </w:t>
       </w:r>
       <w:r>
-        <w:rPr>
-          <w:bCs/>
-          <w:b/>
-        </w:rPr>
-        <w:t xml:space="preserve">Increased investment in, and standardization of, mitigation approaches for those harder resources could keep more projects on the faster FONSI track</w:t>
+        <w:t xml:space="preserve">“</w:t>
+      </w:r>
+      <w:r>
+        <w:t xml:space="preserve">mitigated FONSI</w:t>
+      </w:r>
+      <w:r>
+        <w:t xml:space="preserve">”</w:t>
       </w:r>
       <w:r>
         <w:t xml:space="preserve"> </w:t>
       </w:r>
       <w:r>
-        <w:t xml:space="preserve">— provided the measures genuinely reduce impact rather than relabel it.</w:t>
-      </w:r>
-    </w:p>
-    <w:p>
-      <w:pPr>
-        <w:pStyle w:val="BodyText"/>
-      </w:pPr>
-      <w:r>
-        <w:t xml:space="preserve">Second, a caveat that limits how far the</w:t>
-      </w:r>
-      <w:r>
-        <w:t xml:space="preserve"> </w:t>
-      </w:r>
-      <w:r>
-        <w:t xml:space="preserve">“</w:t>
-      </w:r>
-      <w:r>
-        <w:t xml:space="preserve">mitigated FONSI</w:t>
-      </w:r>
-      <w:r>
-        <w:t xml:space="preserve">”</w:t>
-      </w:r>
-      <w:r>
-        <w:t xml:space="preserve"> </w:t>
-      </w:r>
-      <w:r>
-        <w:t xml:space="preserve">label should be trusted. The committed mitigation behind a not-significant finding is, more often than not,</w:t>
-      </w:r>
-      <w:r>
-        <w:t xml:space="preserve"> </w:t>
-      </w:r>
-      <w:r>
-        <w:rPr>
-          <w:bCs/>
-          <w:b/>
-        </w:rPr>
-        <w:t xml:space="preserve">not tied to a demonstrably enforceable permit condition</w:t>
-      </w:r>
-      <w:r>
-        <w:t xml:space="preserve"> </w:t>
-      </w:r>
-      <w:r>
-        <w:t xml:space="preserve">— especially for the softer resources (visual, cultural, soils) that lean on commitments in the document text. This leaves open questions about the effectiveness of mitigation as a tool for avoiding in-depth environmental review: a finding is only as sound as the measures that support it are binding.</w:t>
+        <w:t xml:space="preserve">label should be trusted. The committed mitigation behind a not-significant finding is, more often than not, not tied to a demonstrably enforceable permit condition — especially for the softer resources (visual, cultural, soils) that lean on commitments in the document text. This leaves open questions about the effectiveness of mitigation as a tool for avoiding in-depth environmental review: a finding is only as sound as the measures that support it are binding.</w:t>
       </w:r>
     </w:p>
     <w:p>
@@ -4504,7 +3628,7 @@
         <w:t xml:space="preserve"> </w:t>
       </w:r>
       <w:r>
-        <w:t xml:space="preserve">The single largest friction in this analysis is that agencies name the same resource in many different ways, and significance language is written project by project. A shared, standardized resource-area vocabulary — of the kind contemplated by CEQ’s NEPA and Permitting Data and Technology Standard — would make significance determinations directly comparable across agencies and dramatically sharpen every finding in this fact sheet.</w:t>
+        <w:t xml:space="preserve">The single largest friction in this analysis is that agencies name the same resource in many different ways, and significance language is written project by project. A shared, standardized resource-area vocabulary — of the kind contemplated by CEQ’s NEPA and Permitting Data and Technology Standard — would make significance determinations directly comparable across agencies and would sharpen every finding in this fact sheet.</w:t>
       </w:r>
     </w:p>
     <w:p>
@@ -4737,9 +3861,6 @@
     <w:abstractNumId w:val="990"/>
   </w:num>
   <w:num w:numId="1001">
-    <w:abstractNumId w:val="991"/>
-  </w:num>
-  <w:num w:numId="1002">
     <w:abstractNumId w:val="991"/>
   </w:num>
 </w:numbering>

</xml_diff>

<commit_message>
[D2, report] fix EIS-factor subtitle wording, FS5 QA accuracy tweaks; gitignore docs/site_libs
Co-Authored-By: Claude Fable 5 <noreply@anthropic.com>
</commit_message>
<xml_diff>
--- a/phase2/factsheets/factsheet5_significance.docx
+++ b/phase2/factsheets/factsheet5_significance.docx
@@ -1250,7 +1250,7 @@
         </w:r>
       </w:hyperlink>
       <w:r>
-        <w:t xml:space="preserve">): transmission and wind lean hardest on mitigation — linear corridors and turbine sites touch habitat, viewsheds, and cultural resources — while solar and storage sit closer to the corpus average.</w:t>
+        <w:t xml:space="preserve">): transmission and wind lean hardest on mitigation — linear corridors and turbine sites touch habitat, viewsheds, and cultural resources — while solar and storage sit at or below the corpus average.</w:t>
       </w:r>
     </w:p>
     <w:tbl>
@@ -1983,7 +1983,7 @@
         </w:r>
       </w:hyperlink>
       <w:r>
-        <w:t xml:space="preserve">): over a third of crossing EISs do so on a single resource and the median is two, though a few span nearly the entire environmental slate.</w:t>
+        <w:t xml:space="preserve">): over a third of crossing EISs do so on a single resource and the median is two, though a long tail — 284 documents — crosses on three or more.</w:t>
       </w:r>
     </w:p>
     <w:tbl>

</xml_diff>